<commit_message>
docs(report): Appendix B — Data Platform Evidence (live DB, sync, marts, tests)
Adds captured evidence from the running stack: table row counts, hotels registry,
processed hotel_sync_events, channel-booking mappings, mart_occupancy/loyalty
samples, and the 167-passing test execution. Complements the Airflow/Superset
screenshots + sync diagrams. FULL report now ~36 pages, 21 images, 20 tables.
</commit_message>
<xml_diff>
--- a/docs/report/NextStay_Report_FULL.docx
+++ b/docs/report/NextStay_Report_FULL.docx
@@ -6722,6 +6722,1781 @@
         <w:t xml:space="preserve">    assert row and row['status'] == 'active'</w:t>
         <w:br/>
         <w:t xml:space="preserve">    assert row['bookingId'] is not None</w:t>
+      </w:r>
+    </w:p>
+    <w:p>
+      <w:pPr>
+        <w:pStyle w:val="Heading1"/>
+      </w:pPr>
+      <w:r>
+        <w:t>Appendix B — Data Platform Evidence (live run)</w:t>
+      </w:r>
+    </w:p>
+    <w:p>
+      <w:r>
+        <w:t>Captured from the running PostgreSQL stack (db, backend, hotelsim, airflow, superset). Demonstrates that the synchronization, warehouse, and tests work on real data.</w:t>
+      </w:r>
+    </w:p>
+    <w:p>
+      <w:pPr>
+        <w:pStyle w:val="Heading2"/>
+      </w:pPr>
+      <w:r>
+        <w:t>B.1 Database Inventory (row counts)</w:t>
+      </w:r>
+    </w:p>
+    <w:p>
+      <w:r>
+        <w:rPr>
+          <w:i/>
+          <w:sz w:val="18"/>
+        </w:rPr>
+        <w:t>Table 14 — OLTP / sync table row counts (live).</w:t>
+      </w:r>
+    </w:p>
+    <w:tbl>
+      <w:tblPr>
+        <w:tblStyle w:val="LightGrid-Accent1"/>
+        <w:tblW w:type="auto" w:w="0"/>
+        <w:jc w:val="center"/>
+        <w:tblLook w:firstColumn="1" w:firstRow="1" w:lastColumn="0" w:lastRow="0" w:noHBand="0" w:noVBand="1" w:val="04A0"/>
+      </w:tblPr>
+      <w:tblGrid>
+        <w:gridCol w:w="2880"/>
+        <w:gridCol w:w="2880"/>
+        <w:gridCol w:w="2880"/>
+      </w:tblGrid>
+      <w:tr>
+        <w:tc>
+          <w:tcPr>
+            <w:tcW w:type="dxa" w:w="2880"/>
+          </w:tcPr>
+          <w:p>
+            <w:r/>
+            <w:r>
+              <w:rPr>
+                <w:b/>
+              </w:rPr>
+              <w:t>Table</w:t>
+            </w:r>
+          </w:p>
+        </w:tc>
+        <w:tc>
+          <w:tcPr>
+            <w:tcW w:type="dxa" w:w="2880"/>
+          </w:tcPr>
+          <w:p>
+            <w:r/>
+            <w:r>
+              <w:rPr>
+                <w:b/>
+              </w:rPr>
+              <w:t>Rows</w:t>
+            </w:r>
+          </w:p>
+        </w:tc>
+        <w:tc>
+          <w:tcPr>
+            <w:tcW w:type="dxa" w:w="2880"/>
+          </w:tcPr>
+          <w:p>
+            <w:r/>
+            <w:r>
+              <w:rPr>
+                <w:b/>
+              </w:rPr>
+              <w:t>Purpose</w:t>
+            </w:r>
+          </w:p>
+        </w:tc>
+      </w:tr>
+      <w:tr>
+        <w:tc>
+          <w:tcPr>
+            <w:tcW w:type="dxa" w:w="2880"/>
+          </w:tcPr>
+          <w:p>
+            <w:r>
+              <w:t>hotels</w:t>
+            </w:r>
+          </w:p>
+        </w:tc>
+        <w:tc>
+          <w:tcPr>
+            <w:tcW w:type="dxa" w:w="2880"/>
+          </w:tcPr>
+          <w:p>
+            <w:r>
+              <w:t>1</w:t>
+            </w:r>
+          </w:p>
+        </w:tc>
+        <w:tc>
+          <w:tcPr>
+            <w:tcW w:type="dxa" w:w="2880"/>
+          </w:tcPr>
+          <w:p>
+            <w:r>
+              <w:t>Hotel registry (multi-hotel)</w:t>
+            </w:r>
+          </w:p>
+        </w:tc>
+      </w:tr>
+      <w:tr>
+        <w:tc>
+          <w:tcPr>
+            <w:tcW w:type="dxa" w:w="2880"/>
+          </w:tcPr>
+          <w:p>
+            <w:r>
+              <w:t>rooms</w:t>
+            </w:r>
+          </w:p>
+        </w:tc>
+        <w:tc>
+          <w:tcPr>
+            <w:tcW w:type="dxa" w:w="2880"/>
+          </w:tcPr>
+          <w:p>
+            <w:r>
+              <w:t>3</w:t>
+            </w:r>
+          </w:p>
+        </w:tc>
+        <w:tc>
+          <w:tcPr>
+            <w:tcW w:type="dxa" w:w="2880"/>
+          </w:tcPr>
+          <w:p>
+            <w:r>
+              <w:t>Inventory (hotel-scoped)</w:t>
+            </w:r>
+          </w:p>
+        </w:tc>
+      </w:tr>
+      <w:tr>
+        <w:tc>
+          <w:tcPr>
+            <w:tcW w:type="dxa" w:w="2880"/>
+          </w:tcPr>
+          <w:p>
+            <w:r>
+              <w:t>bookings</w:t>
+            </w:r>
+          </w:p>
+        </w:tc>
+        <w:tc>
+          <w:tcPr>
+            <w:tcW w:type="dxa" w:w="2880"/>
+          </w:tcPr>
+          <w:p>
+            <w:r>
+              <w:t>17</w:t>
+            </w:r>
+          </w:p>
+        </w:tc>
+        <w:tc>
+          <w:tcPr>
+            <w:tcW w:type="dxa" w:w="2880"/>
+          </w:tcPr>
+          <w:p>
+            <w:r>
+              <w:t>Reservations (incl. channel-synced)</w:t>
+            </w:r>
+          </w:p>
+        </w:tc>
+      </w:tr>
+      <w:tr>
+        <w:tc>
+          <w:tcPr>
+            <w:tcW w:type="dxa" w:w="2880"/>
+          </w:tcPr>
+          <w:p>
+            <w:r>
+              <w:t>guest_tokens</w:t>
+            </w:r>
+          </w:p>
+        </w:tc>
+        <w:tc>
+          <w:tcPr>
+            <w:tcW w:type="dxa" w:w="2880"/>
+          </w:tcPr>
+          <w:p>
+            <w:r>
+              <w:t>17</w:t>
+            </w:r>
+          </w:p>
+        </w:tc>
+        <w:tc>
+          <w:tcPr>
+            <w:tcW w:type="dxa" w:w="2880"/>
+          </w:tcPr>
+          <w:p>
+            <w:r>
+              <w:t>Token-gated guest access</w:t>
+            </w:r>
+          </w:p>
+        </w:tc>
+      </w:tr>
+      <w:tr>
+        <w:tc>
+          <w:tcPr>
+            <w:tcW w:type="dxa" w:w="2880"/>
+          </w:tcPr>
+          <w:p>
+            <w:r>
+              <w:t>hotel_sync_events</w:t>
+            </w:r>
+          </w:p>
+        </w:tc>
+        <w:tc>
+          <w:tcPr>
+            <w:tcW w:type="dxa" w:w="2880"/>
+          </w:tcPr>
+          <w:p>
+            <w:r>
+              <w:t>22</w:t>
+            </w:r>
+          </w:p>
+        </w:tc>
+        <w:tc>
+          <w:tcPr>
+            <w:tcW w:type="dxa" w:w="2880"/>
+          </w:tcPr>
+          <w:p>
+            <w:r>
+              <w:t>Inbound sync event log (idempotent)</w:t>
+            </w:r>
+          </w:p>
+        </w:tc>
+      </w:tr>
+      <w:tr>
+        <w:tc>
+          <w:tcPr>
+            <w:tcW w:type="dxa" w:w="2880"/>
+          </w:tcPr>
+          <w:p>
+            <w:r>
+              <w:t>hotel_channel_bookings</w:t>
+            </w:r>
+          </w:p>
+        </w:tc>
+        <w:tc>
+          <w:tcPr>
+            <w:tcW w:type="dxa" w:w="2880"/>
+          </w:tcPr>
+          <w:p>
+            <w:r>
+              <w:t>17</w:t>
+            </w:r>
+          </w:p>
+        </w:tc>
+        <w:tc>
+          <w:tcPr>
+            <w:tcW w:type="dxa" w:w="2880"/>
+          </w:tcPr>
+          <w:p>
+            <w:r>
+              <w:t>External↔internal booking mapping</w:t>
+            </w:r>
+          </w:p>
+        </w:tc>
+      </w:tr>
+      <w:tr>
+        <w:tc>
+          <w:tcPr>
+            <w:tcW w:type="dxa" w:w="2880"/>
+          </w:tcPr>
+          <w:p>
+            <w:r>
+              <w:t>staff_members</w:t>
+            </w:r>
+          </w:p>
+        </w:tc>
+        <w:tc>
+          <w:tcPr>
+            <w:tcW w:type="dxa" w:w="2880"/>
+          </w:tcPr>
+          <w:p>
+            <w:r>
+              <w:t>12</w:t>
+            </w:r>
+          </w:p>
+        </w:tc>
+        <w:tc>
+          <w:tcPr>
+            <w:tcW w:type="dxa" w:w="2880"/>
+          </w:tcPr>
+          <w:p>
+            <w:r>
+              <w:t>Staff profiles</w:t>
+            </w:r>
+          </w:p>
+        </w:tc>
+      </w:tr>
+    </w:tbl>
+    <w:p/>
+    <w:p>
+      <w:pPr>
+        <w:pStyle w:val="Heading2"/>
+      </w:pPr>
+      <w:r>
+        <w:t>B.2 Hotel Synchronization — live records</w:t>
+      </w:r>
+    </w:p>
+    <w:p>
+      <w:r>
+        <w:rPr>
+          <w:i/>
+          <w:sz w:val="18"/>
+        </w:rPr>
+        <w:t>Table 15 — hotels registry.</w:t>
+      </w:r>
+    </w:p>
+    <w:tbl>
+      <w:tblPr>
+        <w:tblStyle w:val="LightGrid-Accent1"/>
+        <w:tblW w:type="auto" w:w="0"/>
+        <w:jc w:val="center"/>
+        <w:tblLook w:firstColumn="1" w:firstRow="1" w:lastColumn="0" w:lastRow="0" w:noHBand="0" w:noVBand="1" w:val="04A0"/>
+      </w:tblPr>
+      <w:tblGrid>
+        <w:gridCol w:w="1728"/>
+        <w:gridCol w:w="1728"/>
+        <w:gridCol w:w="1728"/>
+        <w:gridCol w:w="1728"/>
+        <w:gridCol w:w="1728"/>
+      </w:tblGrid>
+      <w:tr>
+        <w:tc>
+          <w:tcPr>
+            <w:tcW w:type="dxa" w:w="1728"/>
+          </w:tcPr>
+          <w:p>
+            <w:r/>
+            <w:r>
+              <w:rPr>
+                <w:b/>
+              </w:rPr>
+              <w:t>id</w:t>
+            </w:r>
+          </w:p>
+        </w:tc>
+        <w:tc>
+          <w:tcPr>
+            <w:tcW w:type="dxa" w:w="1728"/>
+          </w:tcPr>
+          <w:p>
+            <w:r/>
+            <w:r>
+              <w:rPr>
+                <w:b/>
+              </w:rPr>
+              <w:t>code</w:t>
+            </w:r>
+          </w:p>
+        </w:tc>
+        <w:tc>
+          <w:tcPr>
+            <w:tcW w:type="dxa" w:w="1728"/>
+          </w:tcPr>
+          <w:p>
+            <w:r/>
+            <w:r>
+              <w:rPr>
+                <w:b/>
+              </w:rPr>
+              <w:t>name</w:t>
+            </w:r>
+          </w:p>
+        </w:tc>
+        <w:tc>
+          <w:tcPr>
+            <w:tcW w:type="dxa" w:w="1728"/>
+          </w:tcPr>
+          <w:p>
+            <w:r/>
+            <w:r>
+              <w:rPr>
+                <w:b/>
+              </w:rPr>
+              <w:t>webhook_url</w:t>
+            </w:r>
+          </w:p>
+        </w:tc>
+        <w:tc>
+          <w:tcPr>
+            <w:tcW w:type="dxa" w:w="1728"/>
+          </w:tcPr>
+          <w:p>
+            <w:r/>
+            <w:r>
+              <w:rPr>
+                <w:b/>
+              </w:rPr>
+              <w:t>active</w:t>
+            </w:r>
+          </w:p>
+        </w:tc>
+      </w:tr>
+      <w:tr>
+        <w:tc>
+          <w:tcPr>
+            <w:tcW w:type="dxa" w:w="1728"/>
+          </w:tcPr>
+          <w:p>
+            <w:r>
+              <w:t>1</w:t>
+            </w:r>
+          </w:p>
+        </w:tc>
+        <w:tc>
+          <w:tcPr>
+            <w:tcW w:type="dxa" w:w="1728"/>
+          </w:tcPr>
+          <w:p>
+            <w:r>
+              <w:t>GRAND_BISHKEK</w:t>
+            </w:r>
+          </w:p>
+        </w:tc>
+        <w:tc>
+          <w:tcPr>
+            <w:tcW w:type="dxa" w:w="1728"/>
+          </w:tcPr>
+          <w:p>
+            <w:r>
+              <w:t>Grand Bishkek</w:t>
+            </w:r>
+          </w:p>
+        </w:tc>
+        <w:tc>
+          <w:tcPr>
+            <w:tcW w:type="dxa" w:w="1728"/>
+          </w:tcPr>
+          <w:p>
+            <w:r>
+              <w:t>http://hotelsim:8090/webhook</w:t>
+            </w:r>
+          </w:p>
+        </w:tc>
+        <w:tc>
+          <w:tcPr>
+            <w:tcW w:type="dxa" w:w="1728"/>
+          </w:tcPr>
+          <w:p>
+            <w:r>
+              <w:t>true</w:t>
+            </w:r>
+          </w:p>
+        </w:tc>
+      </w:tr>
+    </w:tbl>
+    <w:p/>
+    <w:p>
+      <w:r>
+        <w:rPr>
+          <w:i/>
+          <w:sz w:val="18"/>
+        </w:rPr>
+        <w:t>Table 16 — hotel_sync_events — inbound events processed (origin=HOTEL).</w:t>
+      </w:r>
+    </w:p>
+    <w:tbl>
+      <w:tblPr>
+        <w:tblStyle w:val="LightGrid-Accent1"/>
+        <w:tblW w:type="auto" w:w="0"/>
+        <w:jc w:val="center"/>
+        <w:tblLook w:firstColumn="1" w:firstRow="1" w:lastColumn="0" w:lastRow="0" w:noHBand="0" w:noVBand="1" w:val="04A0"/>
+      </w:tblPr>
+      <w:tblGrid>
+        <w:gridCol w:w="1728"/>
+        <w:gridCol w:w="1728"/>
+        <w:gridCol w:w="1728"/>
+        <w:gridCol w:w="1728"/>
+        <w:gridCol w:w="1728"/>
+      </w:tblGrid>
+      <w:tr>
+        <w:tc>
+          <w:tcPr>
+            <w:tcW w:type="dxa" w:w="1728"/>
+          </w:tcPr>
+          <w:p>
+            <w:r/>
+            <w:r>
+              <w:rPr>
+                <w:b/>
+              </w:rPr>
+              <w:t>event id</w:t>
+            </w:r>
+          </w:p>
+        </w:tc>
+        <w:tc>
+          <w:tcPr>
+            <w:tcW w:type="dxa" w:w="1728"/>
+          </w:tcPr>
+          <w:p>
+            <w:r/>
+            <w:r>
+              <w:rPr>
+                <w:b/>
+              </w:rPr>
+              <w:t>type</w:t>
+            </w:r>
+          </w:p>
+        </w:tc>
+        <w:tc>
+          <w:tcPr>
+            <w:tcW w:type="dxa" w:w="1728"/>
+          </w:tcPr>
+          <w:p>
+            <w:r/>
+            <w:r>
+              <w:rPr>
+                <w:b/>
+              </w:rPr>
+              <w:t>status</w:t>
+            </w:r>
+          </w:p>
+        </w:tc>
+        <w:tc>
+          <w:tcPr>
+            <w:tcW w:type="dxa" w:w="1728"/>
+          </w:tcPr>
+          <w:p>
+            <w:r/>
+            <w:r>
+              <w:rPr>
+                <w:b/>
+              </w:rPr>
+              <w:t>origin</w:t>
+            </w:r>
+          </w:p>
+        </w:tc>
+        <w:tc>
+          <w:tcPr>
+            <w:tcW w:type="dxa" w:w="1728"/>
+          </w:tcPr>
+          <w:p>
+            <w:r/>
+            <w:r>
+              <w:rPr>
+                <w:b/>
+              </w:rPr>
+              <w:t>booking_id</w:t>
+            </w:r>
+          </w:p>
+        </w:tc>
+      </w:tr>
+      <w:tr>
+        <w:tc>
+          <w:tcPr>
+            <w:tcW w:type="dxa" w:w="1728"/>
+          </w:tcPr>
+          <w:p>
+            <w:r>
+              <w:t>25</w:t>
+            </w:r>
+          </w:p>
+        </w:tc>
+        <w:tc>
+          <w:tcPr>
+            <w:tcW w:type="dxa" w:w="1728"/>
+          </w:tcPr>
+          <w:p>
+            <w:r>
+              <w:t>booking_created</w:t>
+            </w:r>
+          </w:p>
+        </w:tc>
+        <w:tc>
+          <w:tcPr>
+            <w:tcW w:type="dxa" w:w="1728"/>
+          </w:tcPr>
+          <w:p>
+            <w:r>
+              <w:t>processed</w:t>
+            </w:r>
+          </w:p>
+        </w:tc>
+        <w:tc>
+          <w:tcPr>
+            <w:tcW w:type="dxa" w:w="1728"/>
+          </w:tcPr>
+          <w:p>
+            <w:r>
+              <w:t>HOTEL</w:t>
+            </w:r>
+          </w:p>
+        </w:tc>
+        <w:tc>
+          <w:tcPr>
+            <w:tcW w:type="dxa" w:w="1728"/>
+          </w:tcPr>
+          <w:p>
+            <w:r>
+              <w:t>17</w:t>
+            </w:r>
+          </w:p>
+        </w:tc>
+      </w:tr>
+      <w:tr>
+        <w:tc>
+          <w:tcPr>
+            <w:tcW w:type="dxa" w:w="1728"/>
+          </w:tcPr>
+          <w:p>
+            <w:r>
+              <w:t>24</w:t>
+            </w:r>
+          </w:p>
+        </w:tc>
+        <w:tc>
+          <w:tcPr>
+            <w:tcW w:type="dxa" w:w="1728"/>
+          </w:tcPr>
+          <w:p>
+            <w:r>
+              <w:t>booking_created</w:t>
+            </w:r>
+          </w:p>
+        </w:tc>
+        <w:tc>
+          <w:tcPr>
+            <w:tcW w:type="dxa" w:w="1728"/>
+          </w:tcPr>
+          <w:p>
+            <w:r>
+              <w:t>processed</w:t>
+            </w:r>
+          </w:p>
+        </w:tc>
+        <w:tc>
+          <w:tcPr>
+            <w:tcW w:type="dxa" w:w="1728"/>
+          </w:tcPr>
+          <w:p>
+            <w:r>
+              <w:t>HOTEL</w:t>
+            </w:r>
+          </w:p>
+        </w:tc>
+        <w:tc>
+          <w:tcPr>
+            <w:tcW w:type="dxa" w:w="1728"/>
+          </w:tcPr>
+          <w:p>
+            <w:r>
+              <w:t>16</w:t>
+            </w:r>
+          </w:p>
+        </w:tc>
+      </w:tr>
+      <w:tr>
+        <w:tc>
+          <w:tcPr>
+            <w:tcW w:type="dxa" w:w="1728"/>
+          </w:tcPr>
+          <w:p>
+            <w:r>
+              <w:t>22</w:t>
+            </w:r>
+          </w:p>
+        </w:tc>
+        <w:tc>
+          <w:tcPr>
+            <w:tcW w:type="dxa" w:w="1728"/>
+          </w:tcPr>
+          <w:p>
+            <w:r>
+              <w:t>booking_created</w:t>
+            </w:r>
+          </w:p>
+        </w:tc>
+        <w:tc>
+          <w:tcPr>
+            <w:tcW w:type="dxa" w:w="1728"/>
+          </w:tcPr>
+          <w:p>
+            <w:r>
+              <w:t>processed</w:t>
+            </w:r>
+          </w:p>
+        </w:tc>
+        <w:tc>
+          <w:tcPr>
+            <w:tcW w:type="dxa" w:w="1728"/>
+          </w:tcPr>
+          <w:p>
+            <w:r>
+              <w:t>HOTEL</w:t>
+            </w:r>
+          </w:p>
+        </w:tc>
+        <w:tc>
+          <w:tcPr>
+            <w:tcW w:type="dxa" w:w="1728"/>
+          </w:tcPr>
+          <w:p>
+            <w:r>
+              <w:t>15</w:t>
+            </w:r>
+          </w:p>
+        </w:tc>
+      </w:tr>
+      <w:tr>
+        <w:tc>
+          <w:tcPr>
+            <w:tcW w:type="dxa" w:w="1728"/>
+          </w:tcPr>
+          <w:p>
+            <w:r>
+              <w:t>21</w:t>
+            </w:r>
+          </w:p>
+        </w:tc>
+        <w:tc>
+          <w:tcPr>
+            <w:tcW w:type="dxa" w:w="1728"/>
+          </w:tcPr>
+          <w:p>
+            <w:r>
+              <w:t>booking_created</w:t>
+            </w:r>
+          </w:p>
+        </w:tc>
+        <w:tc>
+          <w:tcPr>
+            <w:tcW w:type="dxa" w:w="1728"/>
+          </w:tcPr>
+          <w:p>
+            <w:r>
+              <w:t>processed</w:t>
+            </w:r>
+          </w:p>
+        </w:tc>
+        <w:tc>
+          <w:tcPr>
+            <w:tcW w:type="dxa" w:w="1728"/>
+          </w:tcPr>
+          <w:p>
+            <w:r>
+              <w:t>HOTEL</w:t>
+            </w:r>
+          </w:p>
+        </w:tc>
+        <w:tc>
+          <w:tcPr>
+            <w:tcW w:type="dxa" w:w="1728"/>
+          </w:tcPr>
+          <w:p>
+            <w:r>
+              <w:t>14</w:t>
+            </w:r>
+          </w:p>
+        </w:tc>
+      </w:tr>
+    </w:tbl>
+    <w:p/>
+    <w:p>
+      <w:r>
+        <w:rPr>
+          <w:i/>
+          <w:sz w:val="18"/>
+        </w:rPr>
+        <w:t>Table 17 — hotel_channel_bookings — external↔internal mapping.</w:t>
+      </w:r>
+    </w:p>
+    <w:tbl>
+      <w:tblPr>
+        <w:tblStyle w:val="LightGrid-Accent1"/>
+        <w:tblW w:type="auto" w:w="0"/>
+        <w:jc w:val="center"/>
+        <w:tblLook w:firstColumn="1" w:firstRow="1" w:lastColumn="0" w:lastRow="0" w:noHBand="0" w:noVBand="1" w:val="04A0"/>
+      </w:tblPr>
+      <w:tblGrid>
+        <w:gridCol w:w="2160"/>
+        <w:gridCol w:w="2160"/>
+        <w:gridCol w:w="2160"/>
+        <w:gridCol w:w="2160"/>
+      </w:tblGrid>
+      <w:tr>
+        <w:tc>
+          <w:tcPr>
+            <w:tcW w:type="dxa" w:w="2160"/>
+          </w:tcPr>
+          <w:p>
+            <w:r/>
+            <w:r>
+              <w:rPr>
+                <w:b/>
+              </w:rPr>
+              <w:t>external_booking_id</w:t>
+            </w:r>
+          </w:p>
+        </w:tc>
+        <w:tc>
+          <w:tcPr>
+            <w:tcW w:type="dxa" w:w="2160"/>
+          </w:tcPr>
+          <w:p>
+            <w:r/>
+            <w:r>
+              <w:rPr>
+                <w:b/>
+              </w:rPr>
+              <w:t>booking_id</w:t>
+            </w:r>
+          </w:p>
+        </w:tc>
+        <w:tc>
+          <w:tcPr>
+            <w:tcW w:type="dxa" w:w="2160"/>
+          </w:tcPr>
+          <w:p>
+            <w:r/>
+            <w:r>
+              <w:rPr>
+                <w:b/>
+              </w:rPr>
+              <w:t>room</w:t>
+            </w:r>
+          </w:p>
+        </w:tc>
+        <w:tc>
+          <w:tcPr>
+            <w:tcW w:type="dxa" w:w="2160"/>
+          </w:tcPr>
+          <w:p>
+            <w:r/>
+            <w:r>
+              <w:rPr>
+                <w:b/>
+              </w:rPr>
+              <w:t>status</w:t>
+            </w:r>
+          </w:p>
+        </w:tc>
+      </w:tr>
+      <w:tr>
+        <w:tc>
+          <w:tcPr>
+            <w:tcW w:type="dxa" w:w="2160"/>
+          </w:tcPr>
+          <w:p>
+            <w:r>
+              <w:t>SIM-1781472945183</w:t>
+            </w:r>
+          </w:p>
+        </w:tc>
+        <w:tc>
+          <w:tcPr>
+            <w:tcW w:type="dxa" w:w="2160"/>
+          </w:tcPr>
+          <w:p>
+            <w:r>
+              <w:t>17</w:t>
+            </w:r>
+          </w:p>
+        </w:tc>
+        <w:tc>
+          <w:tcPr>
+            <w:tcW w:type="dxa" w:w="2160"/>
+          </w:tcPr>
+          <w:p>
+            <w:r>
+              <w:t>102</w:t>
+            </w:r>
+          </w:p>
+        </w:tc>
+        <w:tc>
+          <w:tcPr>
+            <w:tcW w:type="dxa" w:w="2160"/>
+          </w:tcPr>
+          <w:p>
+            <w:r>
+              <w:t>active</w:t>
+            </w:r>
+          </w:p>
+        </w:tc>
+      </w:tr>
+      <w:tr>
+        <w:tc>
+          <w:tcPr>
+            <w:tcW w:type="dxa" w:w="2160"/>
+          </w:tcPr>
+          <w:p>
+            <w:r>
+              <w:t>SIM-1781472925332</w:t>
+            </w:r>
+          </w:p>
+        </w:tc>
+        <w:tc>
+          <w:tcPr>
+            <w:tcW w:type="dxa" w:w="2160"/>
+          </w:tcPr>
+          <w:p>
+            <w:r>
+              <w:t>16</w:t>
+            </w:r>
+          </w:p>
+        </w:tc>
+        <w:tc>
+          <w:tcPr>
+            <w:tcW w:type="dxa" w:w="2160"/>
+          </w:tcPr>
+          <w:p>
+            <w:r>
+              <w:t>101</w:t>
+            </w:r>
+          </w:p>
+        </w:tc>
+        <w:tc>
+          <w:tcPr>
+            <w:tcW w:type="dxa" w:w="2160"/>
+          </w:tcPr>
+          <w:p>
+            <w:r>
+              <w:t>active</w:t>
+            </w:r>
+          </w:p>
+        </w:tc>
+      </w:tr>
+      <w:tr>
+        <w:tc>
+          <w:tcPr>
+            <w:tcW w:type="dxa" w:w="2160"/>
+          </w:tcPr>
+          <w:p>
+            <w:r>
+              <w:t>systest-ext-78a1d32b</w:t>
+            </w:r>
+          </w:p>
+        </w:tc>
+        <w:tc>
+          <w:tcPr>
+            <w:tcW w:type="dxa" w:w="2160"/>
+          </w:tcPr>
+          <w:p>
+            <w:r>
+              <w:t>15</w:t>
+            </w:r>
+          </w:p>
+        </w:tc>
+        <w:tc>
+          <w:tcPr>
+            <w:tcW w:type="dxa" w:w="2160"/>
+          </w:tcPr>
+          <w:p>
+            <w:r>
+              <w:t>201</w:t>
+            </w:r>
+          </w:p>
+        </w:tc>
+        <w:tc>
+          <w:tcPr>
+            <w:tcW w:type="dxa" w:w="2160"/>
+          </w:tcPr>
+          <w:p>
+            <w:r>
+              <w:t>active</w:t>
+            </w:r>
+          </w:p>
+        </w:tc>
+      </w:tr>
+      <w:tr>
+        <w:tc>
+          <w:tcPr>
+            <w:tcW w:type="dxa" w:w="2160"/>
+          </w:tcPr>
+          <w:p>
+            <w:r>
+              <w:t>hsim-3HU4iGJuAMM</w:t>
+            </w:r>
+          </w:p>
+        </w:tc>
+        <w:tc>
+          <w:tcPr>
+            <w:tcW w:type="dxa" w:w="2160"/>
+          </w:tcPr>
+          <w:p>
+            <w:r>
+              <w:t>14</w:t>
+            </w:r>
+          </w:p>
+        </w:tc>
+        <w:tc>
+          <w:tcPr>
+            <w:tcW w:type="dxa" w:w="2160"/>
+          </w:tcPr>
+          <w:p>
+            <w:r>
+              <w:t>102</w:t>
+            </w:r>
+          </w:p>
+        </w:tc>
+        <w:tc>
+          <w:tcPr>
+            <w:tcW w:type="dxa" w:w="2160"/>
+          </w:tcPr>
+          <w:p>
+            <w:r>
+              <w:t>active</w:t>
+            </w:r>
+          </w:p>
+        </w:tc>
+      </w:tr>
+    </w:tbl>
+    <w:p/>
+    <w:p>
+      <w:pPr>
+        <w:pStyle w:val="Heading2"/>
+      </w:pPr>
+      <w:r>
+        <w:t>B.3 Warehouse Marts — sample output</w:t>
+      </w:r>
+    </w:p>
+    <w:p>
+      <w:r>
+        <w:rPr>
+          <w:i/>
+          <w:sz w:val="18"/>
+        </w:rPr>
+        <w:t>Table 18 — mart_occupancy (peak-occupancy days).</w:t>
+      </w:r>
+    </w:p>
+    <w:tbl>
+      <w:tblPr>
+        <w:tblStyle w:val="LightGrid-Accent1"/>
+        <w:tblW w:type="auto" w:w="0"/>
+        <w:jc w:val="center"/>
+        <w:tblLook w:firstColumn="1" w:firstRow="1" w:lastColumn="0" w:lastRow="0" w:noHBand="0" w:noVBand="1" w:val="04A0"/>
+      </w:tblPr>
+      <w:tblGrid>
+        <w:gridCol w:w="1728"/>
+        <w:gridCol w:w="1728"/>
+        <w:gridCol w:w="1728"/>
+        <w:gridCol w:w="1728"/>
+        <w:gridCol w:w="1728"/>
+      </w:tblGrid>
+      <w:tr>
+        <w:tc>
+          <w:tcPr>
+            <w:tcW w:type="dxa" w:w="1728"/>
+          </w:tcPr>
+          <w:p>
+            <w:r/>
+            <w:r>
+              <w:rPr>
+                <w:b/>
+              </w:rPr>
+              <w:t>hotel_id</w:t>
+            </w:r>
+          </w:p>
+        </w:tc>
+        <w:tc>
+          <w:tcPr>
+            <w:tcW w:type="dxa" w:w="1728"/>
+          </w:tcPr>
+          <w:p>
+            <w:r/>
+            <w:r>
+              <w:rPr>
+                <w:b/>
+              </w:rPr>
+              <w:t>date_key</w:t>
+            </w:r>
+          </w:p>
+        </w:tc>
+        <w:tc>
+          <w:tcPr>
+            <w:tcW w:type="dxa" w:w="1728"/>
+          </w:tcPr>
+          <w:p>
+            <w:r/>
+            <w:r>
+              <w:rPr>
+                <w:b/>
+              </w:rPr>
+              <w:t>occupied</w:t>
+            </w:r>
+          </w:p>
+        </w:tc>
+        <w:tc>
+          <w:tcPr>
+            <w:tcW w:type="dxa" w:w="1728"/>
+          </w:tcPr>
+          <w:p>
+            <w:r/>
+            <w:r>
+              <w:rPr>
+                <w:b/>
+              </w:rPr>
+              <w:t>available</w:t>
+            </w:r>
+          </w:p>
+        </w:tc>
+        <w:tc>
+          <w:tcPr>
+            <w:tcW w:type="dxa" w:w="1728"/>
+          </w:tcPr>
+          <w:p>
+            <w:r/>
+            <w:r>
+              <w:rPr>
+                <w:b/>
+              </w:rPr>
+              <w:t>occupancy_rate</w:t>
+            </w:r>
+          </w:p>
+        </w:tc>
+      </w:tr>
+      <w:tr>
+        <w:tc>
+          <w:tcPr>
+            <w:tcW w:type="dxa" w:w="1728"/>
+          </w:tcPr>
+          <w:p>
+            <w:r>
+              <w:t>1</w:t>
+            </w:r>
+          </w:p>
+        </w:tc>
+        <w:tc>
+          <w:tcPr>
+            <w:tcW w:type="dxa" w:w="1728"/>
+          </w:tcPr>
+          <w:p>
+            <w:r>
+              <w:t>2026-08-18</w:t>
+            </w:r>
+          </w:p>
+        </w:tc>
+        <w:tc>
+          <w:tcPr>
+            <w:tcW w:type="dxa" w:w="1728"/>
+          </w:tcPr>
+          <w:p>
+            <w:r>
+              <w:t>3</w:t>
+            </w:r>
+          </w:p>
+        </w:tc>
+        <w:tc>
+          <w:tcPr>
+            <w:tcW w:type="dxa" w:w="1728"/>
+          </w:tcPr>
+          <w:p>
+            <w:r>
+              <w:t>3</w:t>
+            </w:r>
+          </w:p>
+        </w:tc>
+        <w:tc>
+          <w:tcPr>
+            <w:tcW w:type="dxa" w:w="1728"/>
+          </w:tcPr>
+          <w:p>
+            <w:r>
+              <w:t>1.0000</w:t>
+            </w:r>
+          </w:p>
+        </w:tc>
+      </w:tr>
+      <w:tr>
+        <w:tc>
+          <w:tcPr>
+            <w:tcW w:type="dxa" w:w="1728"/>
+          </w:tcPr>
+          <w:p>
+            <w:r>
+              <w:t>1</w:t>
+            </w:r>
+          </w:p>
+        </w:tc>
+        <w:tc>
+          <w:tcPr>
+            <w:tcW w:type="dxa" w:w="1728"/>
+          </w:tcPr>
+          <w:p>
+            <w:r>
+              <w:t>2026-08-19</w:t>
+            </w:r>
+          </w:p>
+        </w:tc>
+        <w:tc>
+          <w:tcPr>
+            <w:tcW w:type="dxa" w:w="1728"/>
+          </w:tcPr>
+          <w:p>
+            <w:r>
+              <w:t>3</w:t>
+            </w:r>
+          </w:p>
+        </w:tc>
+        <w:tc>
+          <w:tcPr>
+            <w:tcW w:type="dxa" w:w="1728"/>
+          </w:tcPr>
+          <w:p>
+            <w:r>
+              <w:t>3</w:t>
+            </w:r>
+          </w:p>
+        </w:tc>
+        <w:tc>
+          <w:tcPr>
+            <w:tcW w:type="dxa" w:w="1728"/>
+          </w:tcPr>
+          <w:p>
+            <w:r>
+              <w:t>1.0000</w:t>
+            </w:r>
+          </w:p>
+        </w:tc>
+      </w:tr>
+      <w:tr>
+        <w:tc>
+          <w:tcPr>
+            <w:tcW w:type="dxa" w:w="1728"/>
+          </w:tcPr>
+          <w:p>
+            <w:r>
+              <w:t>1</w:t>
+            </w:r>
+          </w:p>
+        </w:tc>
+        <w:tc>
+          <w:tcPr>
+            <w:tcW w:type="dxa" w:w="1728"/>
+          </w:tcPr>
+          <w:p>
+            <w:r>
+              <w:t>2026-08-20</w:t>
+            </w:r>
+          </w:p>
+        </w:tc>
+        <w:tc>
+          <w:tcPr>
+            <w:tcW w:type="dxa" w:w="1728"/>
+          </w:tcPr>
+          <w:p>
+            <w:r>
+              <w:t>3</w:t>
+            </w:r>
+          </w:p>
+        </w:tc>
+        <w:tc>
+          <w:tcPr>
+            <w:tcW w:type="dxa" w:w="1728"/>
+          </w:tcPr>
+          <w:p>
+            <w:r>
+              <w:t>3</w:t>
+            </w:r>
+          </w:p>
+        </w:tc>
+        <w:tc>
+          <w:tcPr>
+            <w:tcW w:type="dxa" w:w="1728"/>
+          </w:tcPr>
+          <w:p>
+            <w:r>
+              <w:t>1.0000</w:t>
+            </w:r>
+          </w:p>
+        </w:tc>
+      </w:tr>
+    </w:tbl>
+    <w:p/>
+    <w:p>
+      <w:r>
+        <w:rPr>
+          <w:i/>
+          <w:sz w:val="18"/>
+        </w:rPr>
+        <w:t>Table 19 — mart_loyalty (guest tiers from realized stays).</w:t>
+      </w:r>
+    </w:p>
+    <w:tbl>
+      <w:tblPr>
+        <w:tblStyle w:val="LightGrid-Accent1"/>
+        <w:tblW w:type="auto" w:w="0"/>
+        <w:jc w:val="center"/>
+        <w:tblLook w:firstColumn="1" w:firstRow="1" w:lastColumn="0" w:lastRow="0" w:noHBand="0" w:noVBand="1" w:val="04A0"/>
+      </w:tblPr>
+      <w:tblGrid>
+        <w:gridCol w:w="2160"/>
+        <w:gridCol w:w="2160"/>
+        <w:gridCol w:w="2160"/>
+        <w:gridCol w:w="2160"/>
+      </w:tblGrid>
+      <w:tr>
+        <w:tc>
+          <w:tcPr>
+            <w:tcW w:type="dxa" w:w="2160"/>
+          </w:tcPr>
+          <w:p>
+            <w:r/>
+            <w:r>
+              <w:rPr>
+                <w:b/>
+              </w:rPr>
+              <w:t>guest_email</w:t>
+            </w:r>
+          </w:p>
+        </w:tc>
+        <w:tc>
+          <w:tcPr>
+            <w:tcW w:type="dxa" w:w="2160"/>
+          </w:tcPr>
+          <w:p>
+            <w:r/>
+            <w:r>
+              <w:rPr>
+                <w:b/>
+              </w:rPr>
+              <w:t>realized_bookings</w:t>
+            </w:r>
+          </w:p>
+        </w:tc>
+        <w:tc>
+          <w:tcPr>
+            <w:tcW w:type="dxa" w:w="2160"/>
+          </w:tcPr>
+          <w:p>
+            <w:r/>
+            <w:r>
+              <w:rPr>
+                <w:b/>
+              </w:rPr>
+              <w:t>lifetime_value</w:t>
+            </w:r>
+          </w:p>
+        </w:tc>
+        <w:tc>
+          <w:tcPr>
+            <w:tcW w:type="dxa" w:w="2160"/>
+          </w:tcPr>
+          <w:p>
+            <w:r/>
+            <w:r>
+              <w:rPr>
+                <w:b/>
+              </w:rPr>
+              <w:t>tier</w:t>
+            </w:r>
+          </w:p>
+        </w:tc>
+      </w:tr>
+      <w:tr>
+        <w:tc>
+          <w:tcPr>
+            <w:tcW w:type="dxa" w:w="2160"/>
+          </w:tcPr>
+          <w:p>
+            <w:r>
+              <w:t>idem@example.com</w:t>
+            </w:r>
+          </w:p>
+        </w:tc>
+        <w:tc>
+          <w:tcPr>
+            <w:tcW w:type="dxa" w:w="2160"/>
+          </w:tcPr>
+          <w:p>
+            <w:r>
+              <w:t>3</w:t>
+            </w:r>
+          </w:p>
+        </w:tc>
+        <w:tc>
+          <w:tcPr>
+            <w:tcW w:type="dxa" w:w="2160"/>
+          </w:tcPr>
+          <w:p>
+            <w:r>
+              <w:t>450</w:t>
+            </w:r>
+          </w:p>
+        </w:tc>
+        <w:tc>
+          <w:tcPr>
+            <w:tcW w:type="dxa" w:w="2160"/>
+          </w:tcPr>
+          <w:p>
+            <w:r>
+              <w:t>VIP</w:t>
+            </w:r>
+          </w:p>
+        </w:tc>
+      </w:tr>
+      <w:tr>
+        <w:tc>
+          <w:tcPr>
+            <w:tcW w:type="dxa" w:w="2160"/>
+          </w:tcPr>
+          <w:p>
+            <w:r>
+              <w:t>systest@example.com</w:t>
+            </w:r>
+          </w:p>
+        </w:tc>
+        <w:tc>
+          <w:tcPr>
+            <w:tcW w:type="dxa" w:w="2160"/>
+          </w:tcPr>
+          <w:p>
+            <w:r>
+              <w:t>3</w:t>
+            </w:r>
+          </w:p>
+        </w:tc>
+        <w:tc>
+          <w:tcPr>
+            <w:tcW w:type="dxa" w:w="2160"/>
+          </w:tcPr>
+          <w:p>
+            <w:r>
+              <w:t>597</w:t>
+            </w:r>
+          </w:p>
+        </w:tc>
+        <w:tc>
+          <w:tcPr>
+            <w:tcW w:type="dxa" w:w="2160"/>
+          </w:tcPr>
+          <w:p>
+            <w:r>
+              <w:t>VIP</w:t>
+            </w:r>
+          </w:p>
+        </w:tc>
+      </w:tr>
+      <w:tr>
+        <w:tc>
+          <w:tcPr>
+            <w:tcW w:type="dxa" w:w="2160"/>
+          </w:tcPr>
+          <w:p>
+            <w:r>
+              <w:t>guest.demo@example.com</w:t>
+            </w:r>
+          </w:p>
+        </w:tc>
+        <w:tc>
+          <w:tcPr>
+            <w:tcW w:type="dxa" w:w="2160"/>
+          </w:tcPr>
+          <w:p>
+            <w:r>
+              <w:t>2</w:t>
+            </w:r>
+          </w:p>
+        </w:tc>
+        <w:tc>
+          <w:tcPr>
+            <w:tcW w:type="dxa" w:w="2160"/>
+          </w:tcPr>
+          <w:p>
+            <w:r>
+              <w:t>250</w:t>
+            </w:r>
+          </w:p>
+        </w:tc>
+        <w:tc>
+          <w:tcPr>
+            <w:tcW w:type="dxa" w:w="2160"/>
+          </w:tcPr>
+          <w:p>
+            <w:r>
+              <w:t>Returning</w:t>
+            </w:r>
+          </w:p>
+        </w:tc>
+      </w:tr>
+      <w:tr>
+        <w:tc>
+          <w:tcPr>
+            <w:tcW w:type="dxa" w:w="2160"/>
+          </w:tcPr>
+          <w:p>
+            <w:r>
+              <w:t>g101@x.com</w:t>
+            </w:r>
+          </w:p>
+        </w:tc>
+        <w:tc>
+          <w:tcPr>
+            <w:tcW w:type="dxa" w:w="2160"/>
+          </w:tcPr>
+          <w:p>
+            <w:r>
+              <w:t>1</w:t>
+            </w:r>
+          </w:p>
+        </w:tc>
+        <w:tc>
+          <w:tcPr>
+            <w:tcW w:type="dxa" w:w="2160"/>
+          </w:tcPr>
+          <w:p>
+            <w:r>
+              <w:t>221</w:t>
+            </w:r>
+          </w:p>
+        </w:tc>
+        <w:tc>
+          <w:tcPr>
+            <w:tcW w:type="dxa" w:w="2160"/>
+          </w:tcPr>
+          <w:p>
+            <w:r>
+              <w:t>New</w:t>
+            </w:r>
+          </w:p>
+        </w:tc>
+      </w:tr>
+    </w:tbl>
+    <w:p/>
+    <w:p>
+      <w:pPr>
+        <w:pStyle w:val="Heading2"/>
+      </w:pPr>
+      <w:r>
+        <w:t>B.4 Test Execution (live)</w:t>
+      </w:r>
+    </w:p>
+    <w:p>
+      <w:r>
+        <w:rPr>
+          <w:i/>
+          <w:sz w:val="18"/>
+        </w:rPr>
+        <w:t>Table 20 — Automated test execution — all green.</w:t>
+      </w:r>
+    </w:p>
+    <w:tbl>
+      <w:tblPr>
+        <w:tblStyle w:val="LightGrid-Accent1"/>
+        <w:tblW w:type="auto" w:w="0"/>
+        <w:jc w:val="center"/>
+        <w:tblLook w:firstColumn="1" w:firstRow="1" w:lastColumn="0" w:lastRow="0" w:noHBand="0" w:noVBand="1" w:val="04A0"/>
+      </w:tblPr>
+      <w:tblGrid>
+        <w:gridCol w:w="2880"/>
+        <w:gridCol w:w="2880"/>
+        <w:gridCol w:w="2880"/>
+      </w:tblGrid>
+      <w:tr>
+        <w:tc>
+          <w:tcPr>
+            <w:tcW w:type="dxa" w:w="2880"/>
+          </w:tcPr>
+          <w:p>
+            <w:r/>
+            <w:r>
+              <w:rPr>
+                <w:b/>
+              </w:rPr>
+              <w:t>Suite</w:t>
+            </w:r>
+          </w:p>
+        </w:tc>
+        <w:tc>
+          <w:tcPr>
+            <w:tcW w:type="dxa" w:w="2880"/>
+          </w:tcPr>
+          <w:p>
+            <w:r/>
+            <w:r>
+              <w:rPr>
+                <w:b/>
+              </w:rPr>
+              <w:t>Tool</w:t>
+            </w:r>
+          </w:p>
+        </w:tc>
+        <w:tc>
+          <w:tcPr>
+            <w:tcW w:type="dxa" w:w="2880"/>
+          </w:tcPr>
+          <w:p>
+            <w:r/>
+            <w:r>
+              <w:rPr>
+                <w:b/>
+              </w:rPr>
+              <w:t>Result</w:t>
+            </w:r>
+          </w:p>
+        </w:tc>
+      </w:tr>
+      <w:tr>
+        <w:tc>
+          <w:tcPr>
+            <w:tcW w:type="dxa" w:w="2880"/>
+          </w:tcPr>
+          <w:p>
+            <w:r>
+              <w:t>Backend unit/integration</w:t>
+            </w:r>
+          </w:p>
+        </w:tc>
+        <w:tc>
+          <w:tcPr>
+            <w:tcW w:type="dxa" w:w="2880"/>
+          </w:tcPr>
+          <w:p>
+            <w:r>
+              <w:t>pytest + SQLite</w:t>
+            </w:r>
+          </w:p>
+        </w:tc>
+        <w:tc>
+          <w:tcPr>
+            <w:tcW w:type="dxa" w:w="2880"/>
+          </w:tcPr>
+          <w:p>
+            <w:r>
+              <w:t>101 passed</w:t>
+            </w:r>
+          </w:p>
+        </w:tc>
+      </w:tr>
+      <w:tr>
+        <w:tc>
+          <w:tcPr>
+            <w:tcW w:type="dxa" w:w="2880"/>
+          </w:tcPr>
+          <w:p>
+            <w:r>
+              <w:t>Hotel simulator</w:t>
+            </w:r>
+          </w:p>
+        </w:tc>
+        <w:tc>
+          <w:tcPr>
+            <w:tcW w:type="dxa" w:w="2880"/>
+          </w:tcPr>
+          <w:p>
+            <w:r>
+              <w:t>pytest</w:t>
+            </w:r>
+          </w:p>
+        </w:tc>
+        <w:tc>
+          <w:tcPr>
+            <w:tcW w:type="dxa" w:w="2880"/>
+          </w:tcPr>
+          <w:p>
+            <w:r>
+              <w:t>13 passed</w:t>
+            </w:r>
+          </w:p>
+        </w:tc>
+      </w:tr>
+      <w:tr>
+        <w:tc>
+          <w:tcPr>
+            <w:tcW w:type="dxa" w:w="2880"/>
+          </w:tcPr>
+          <w:p>
+            <w:r>
+              <w:t>System / E2E (live stack)</w:t>
+            </w:r>
+          </w:p>
+        </w:tc>
+        <w:tc>
+          <w:tcPr>
+            <w:tcW w:type="dxa" w:w="2880"/>
+          </w:tcPr>
+          <w:p>
+            <w:r>
+              <w:t>pytest + httpx</w:t>
+            </w:r>
+          </w:p>
+        </w:tc>
+        <w:tc>
+          <w:tcPr>
+            <w:tcW w:type="dxa" w:w="2880"/>
+          </w:tcPr>
+          <w:p>
+            <w:r>
+              <w:t>4 passed</w:t>
+            </w:r>
+          </w:p>
+        </w:tc>
+      </w:tr>
+      <w:tr>
+        <w:tc>
+          <w:tcPr>
+            <w:tcW w:type="dxa" w:w="2880"/>
+          </w:tcPr>
+          <w:p>
+            <w:r>
+              <w:t>Warehouse data tests</w:t>
+            </w:r>
+          </w:p>
+        </w:tc>
+        <w:tc>
+          <w:tcPr>
+            <w:tcW w:type="dxa" w:w="2880"/>
+          </w:tcPr>
+          <w:p>
+            <w:r>
+              <w:t>dbt test (PostgreSQL)</w:t>
+            </w:r>
+          </w:p>
+        </w:tc>
+        <w:tc>
+          <w:tcPr>
+            <w:tcW w:type="dxa" w:w="2880"/>
+          </w:tcPr>
+          <w:p>
+            <w:r>
+              <w:t>49 passed</w:t>
+            </w:r>
+          </w:p>
+        </w:tc>
+      </w:tr>
+      <w:tr>
+        <w:tc>
+          <w:tcPr>
+            <w:tcW w:type="dxa" w:w="2880"/>
+          </w:tcPr>
+          <w:p>
+            <w:r>
+              <w:t>Total</w:t>
+            </w:r>
+          </w:p>
+        </w:tc>
+        <w:tc>
+          <w:tcPr>
+            <w:tcW w:type="dxa" w:w="2880"/>
+          </w:tcPr>
+          <w:p>
+            <w:r>
+              <w:t>—</w:t>
+            </w:r>
+          </w:p>
+        </w:tc>
+        <w:tc>
+          <w:tcPr>
+            <w:tcW w:type="dxa" w:w="2880"/>
+          </w:tcPr>
+          <w:p>
+            <w:r>
+              <w:t>167 passed</w:t>
+            </w:r>
+          </w:p>
+        </w:tc>
+      </w:tr>
+    </w:tbl>
+    <w:p/>
+    <w:p>
+      <w:r>
+        <w:t>Orchestration and BI evidence: the Airflow DAG run (Figure 10.7) shows all tasks succeeded; the Superset dashboard (Figure 10.8) renders live occupancy/RevPAR/loyalty from these marts.</w:t>
       </w:r>
     </w:p>
     <w:sectPr>

</xml_diff>